<commit_message>
Manual and tests for normal/train versions; dataset test reloads until images exist
Co-Authored-By: Claude Opus 5.5 <noreply@anthropic.com>
Claude-Session: https://claude.ai/code/session_01SdR1RsRyVyFgrWst25ZXhg
</commit_message>
<xml_diff>
--- a/bird_repeller/docs/คู่มือการใช้งานเครื่องไล่นกอัตโนมัติ.docx
+++ b/bird_repeller/docs/คู่มือการใช้งานเครื่องไล่นกอัตโนมัติ.docx
@@ -168,7 +168,7 @@
           <w:sz w:val="28"/>
           <w:szCs w:val="28"/>
         </w:rPr>
-        <w:t xml:space="preserve">เอกสารนี้ใช้คู่กับเฟิร์มแวร์บอร์ดควบคุม BIRDCTRL v7.8 และเซิร์ฟเวอร์ v7.0</w:t>
+        <w:t xml:space="preserve">เอกสารนี้ใช้คู่กับเฟิร์มแวร์บอร์ดควบคุม BIRDCTRL v7.8 และเซิร์ฟเวอร์ v7.1</w:t>
       </w:r>
     </w:p>
     <w:p>
@@ -298,7 +298,7 @@
           </w:pPr>
           <w:hyperlink w:history="1" w:anchor="_Toc2">
             <w:r>
-              <w:t xml:space="preserve">1.1 โหมดการทำงานของเซิร์ฟเวอร์</w:t>
+              <w:t xml:space="preserve">1.1 เวอร์ชันใช้งานปกติ และเวอร์ชันเก็บภาพเทรน</w:t>
             </w:r>
             <w:r>
               <w:tab/>
@@ -616,7 +616,7 @@
           </w:pPr>
           <w:hyperlink w:history="1" w:anchor="_Toc16">
             <w:r>
-              <w:t xml:space="preserve">5.10 เก็บภาพและติดป้ายสำหรับเทรนโมเดล</w:t>
+              <w:t xml:space="preserve">5.10 เก็บภาพและติดป้ายสำหรับเทรนโมเดล (เวอร์ชัน train)</w:t>
             </w:r>
             <w:r>
               <w:tab/>
@@ -1141,7 +1141,7 @@
           <w:sz w:val="34"/>
           <w:szCs w:val="34"/>
         </w:rPr>
-        <w:t xml:space="preserve">1.1 โหมดการทำงานของเซิร์ฟเวอร์</w:t>
+        <w:t xml:space="preserve">1.1 เวอร์ชันใช้งานปกติ และเวอร์ชันเก็บภาพเทรน</w:t>
       </w:r>
       <w:bookmarkEnd w:id="2"/>
     </w:p>
@@ -1154,7 +1154,7 @@
           <w:sz w:val="32"/>
           <w:szCs w:val="32"/>
         </w:rPr>
-        <w:t xml:space="preserve">เซิร์ฟเวอร์มี 3 โหมด ตั้งผ่านตัวแปร BIRD_MODE (ค่าเริ่มต้นคือ field)</w:t>
+        <w:t xml:space="preserve">โปรแกรมบน Pi มี 2 เวอร์ชันในไฟล์เดียว เลือกที่บรรทัด MODE_DEFAULT ต้นไฟล์ raspberry_pi_server.py หรือใส่ Environment=BIRD_MODE=train ในไฟล์ bird.service แล้วรีสตาร์ทบริการ หน้าเว็บมีป้ายบอกเวอร์ชันที่มุมบน</w:t>
       </w:r>
     </w:p>
     <w:tbl>
@@ -1171,9 +1171,9 @@
       </w:tblPr>
       <w:tblGrid>
         <w:gridCol w:w="1500"/>
-        <w:gridCol w:w="2200"/>
-        <w:gridCol w:w="2200"/>
-        <w:gridCol w:w="3738"/>
+        <w:gridCol w:w="2700"/>
+        <w:gridCol w:w="2500"/>
+        <w:gridCol w:w="2938"/>
       </w:tblGrid>
       <w:tr>
         <w:trPr>
@@ -1208,13 +1208,13 @@
                 <w:sz w:val="28"/>
                 <w:szCs w:val="28"/>
               </w:rPr>
-              <w:t xml:space="preserve">โหมด</w:t>
-            </w:r>
-          </w:p>
-        </w:tc>
-        <w:tc>
-          <w:tcPr>
-            <w:tcW w:type="dxa" w:w="2200"/>
+              <w:t xml:space="preserve">เวอร์ชัน</w:t>
+            </w:r>
+          </w:p>
+        </w:tc>
+        <w:tc>
+          <w:tcPr>
+            <w:tcW w:type="dxa" w:w="2700"/>
             <w:tcBorders>
               <w:top w:val="single" w:color="808080" w:sz="4"/>
               <w:left w:val="single" w:color="808080" w:sz="4"/>
@@ -1247,7 +1247,7 @@
         </w:tc>
         <w:tc>
           <w:tcPr>
-            <w:tcW w:type="dxa" w:w="2200"/>
+            <w:tcW w:type="dxa" w:w="2500"/>
             <w:tcBorders>
               <w:top w:val="single" w:color="808080" w:sz="4"/>
               <w:left w:val="single" w:color="808080" w:sz="4"/>
@@ -1274,13 +1274,13 @@
                 <w:sz w:val="28"/>
                 <w:szCs w:val="28"/>
               </w:rPr>
-              <w:t xml:space="preserve">เกณฑ์ความมั่นใจ</w:t>
-            </w:r>
-          </w:p>
-        </w:tc>
-        <w:tc>
-          <w:tcPr>
-            <w:tcW w:type="dxa" w:w="3738"/>
+              <w:t xml:space="preserve">เก็บภาพเทรน</w:t>
+            </w:r>
+          </w:p>
+        </w:tc>
+        <w:tc>
+          <w:tcPr>
+            <w:tcW w:type="dxa" w:w="2938"/>
             <w:tcBorders>
               <w:top w:val="single" w:color="808080" w:sz="4"/>
               <w:left w:val="single" w:color="808080" w:sz="4"/>
@@ -1344,103 +1344,117 @@
                 <w:sz w:val="28"/>
                 <w:szCs w:val="28"/>
               </w:rPr>
-              <w:t xml:space="preserve">field</w:t>
-            </w:r>
-          </w:p>
-        </w:tc>
-        <w:tc>
-          <w:tcPr>
-            <w:tcW w:type="dxa" w:w="2200"/>
-            <w:tcBorders>
-              <w:top w:val="single" w:color="808080" w:sz="4"/>
-              <w:left w:val="single" w:color="808080" w:sz="4"/>
-              <w:bottom w:val="single" w:color="808080" w:sz="4"/>
-              <w:right w:val="single" w:color="808080" w:sz="4"/>
-            </w:tcBorders>
-            <w:tcMar>
-              <w:top w:type="dxa" w:w="60"/>
-              <w:left w:type="dxa" w:w="100"/>
-              <w:bottom w:type="dxa" w:w="60"/>
-              <w:right w:type="dxa" w:w="100"/>
-            </w:tcMar>
-            <w:vAlign w:val="center"/>
-          </w:tcPr>
-          <w:p>
-            <w:pPr>
-              <w:spacing w:after="20" w:line="320"/>
-            </w:pPr>
-            <w:r>
-              <w:rPr>
-                <w:b w:val="false"/>
-                <w:bCs w:val="false"/>
-                <w:sz w:val="28"/>
-                <w:szCs w:val="28"/>
-              </w:rPr>
-              <w:t xml:space="preserve">ไล่จริง (ปั๊ม + มอเตอร์)</w:t>
-            </w:r>
-          </w:p>
-        </w:tc>
-        <w:tc>
-          <w:tcPr>
-            <w:tcW w:type="dxa" w:w="2200"/>
-            <w:tcBorders>
-              <w:top w:val="single" w:color="808080" w:sz="4"/>
-              <w:left w:val="single" w:color="808080" w:sz="4"/>
-              <w:bottom w:val="single" w:color="808080" w:sz="4"/>
-              <w:right w:val="single" w:color="808080" w:sz="4"/>
-            </w:tcBorders>
-            <w:tcMar>
-              <w:top w:type="dxa" w:w="60"/>
-              <w:left w:type="dxa" w:w="100"/>
-              <w:bottom w:type="dxa" w:w="60"/>
-              <w:right w:type="dxa" w:w="100"/>
-            </w:tcMar>
-            <w:vAlign w:val="center"/>
-          </w:tcPr>
-          <w:p>
-            <w:pPr>
-              <w:spacing w:after="20" w:line="320"/>
-            </w:pPr>
-            <w:r>
-              <w:rPr>
-                <w:b w:val="false"/>
-                <w:bCs w:val="false"/>
-                <w:sz w:val="28"/>
-                <w:szCs w:val="28"/>
-              </w:rPr>
-              <w:t xml:space="preserve">0.30 และต้องเจอ 2 เฟรมติดกัน</w:t>
-            </w:r>
-          </w:p>
-        </w:tc>
-        <w:tc>
-          <w:tcPr>
-            <w:tcW w:type="dxa" w:w="3738"/>
-            <w:tcBorders>
-              <w:top w:val="single" w:color="808080" w:sz="4"/>
-              <w:left w:val="single" w:color="808080" w:sz="4"/>
-              <w:bottom w:val="single" w:color="808080" w:sz="4"/>
-              <w:right w:val="single" w:color="808080" w:sz="4"/>
-            </w:tcBorders>
-            <w:tcMar>
-              <w:top w:type="dxa" w:w="60"/>
-              <w:left w:type="dxa" w:w="100"/>
-              <w:bottom w:type="dxa" w:w="60"/>
-              <w:right w:type="dxa" w:w="100"/>
-            </w:tcMar>
-            <w:vAlign w:val="center"/>
-          </w:tcPr>
-          <w:p>
-            <w:pPr>
-              <w:spacing w:after="20" w:line="320"/>
-            </w:pPr>
-            <w:r>
-              <w:rPr>
-                <w:b w:val="false"/>
-                <w:bCs w:val="false"/>
-                <w:sz w:val="28"/>
-                <w:szCs w:val="28"/>
-              </w:rPr>
-              <w:t xml:space="preserve">ติดตั้งหน้างานเพื่อทดสอบและเก็บข้อมูล</w:t>
+              <w:t xml:space="preserve">normal</w:t>
+            </w:r>
+          </w:p>
+          <w:p>
+            <w:pPr>
+              <w:spacing w:after="20" w:line="320"/>
+            </w:pPr>
+            <w:r>
+              <w:rPr>
+                <w:b w:val="false"/>
+                <w:bCs w:val="false"/>
+                <w:sz w:val="28"/>
+                <w:szCs w:val="28"/>
+              </w:rPr>
+              <w:t xml:space="preserve">(ค่าเริ่มต้น)</w:t>
+            </w:r>
+          </w:p>
+        </w:tc>
+        <w:tc>
+          <w:tcPr>
+            <w:tcW w:type="dxa" w:w="2700"/>
+            <w:tcBorders>
+              <w:top w:val="single" w:color="808080" w:sz="4"/>
+              <w:left w:val="single" w:color="808080" w:sz="4"/>
+              <w:bottom w:val="single" w:color="808080" w:sz="4"/>
+              <w:right w:val="single" w:color="808080" w:sz="4"/>
+            </w:tcBorders>
+            <w:tcMar>
+              <w:top w:type="dxa" w:w="60"/>
+              <w:left w:type="dxa" w:w="100"/>
+              <w:bottom w:type="dxa" w:w="60"/>
+              <w:right w:type="dxa" w:w="100"/>
+            </w:tcMar>
+            <w:vAlign w:val="center"/>
+          </w:tcPr>
+          <w:p>
+            <w:pPr>
+              <w:spacing w:after="20" w:line="320"/>
+            </w:pPr>
+            <w:r>
+              <w:rPr>
+                <w:b w:val="false"/>
+                <w:bCs w:val="false"/>
+                <w:sz w:val="28"/>
+                <w:szCs w:val="28"/>
+              </w:rPr>
+              <w:t xml:space="preserve">ไล่จริง เมื่อเจอ 2 เฟรมติดกัน (เกณฑ์ 0.30)</w:t>
+            </w:r>
+          </w:p>
+        </w:tc>
+        <w:tc>
+          <w:tcPr>
+            <w:tcW w:type="dxa" w:w="2500"/>
+            <w:tcBorders>
+              <w:top w:val="single" w:color="808080" w:sz="4"/>
+              <w:left w:val="single" w:color="808080" w:sz="4"/>
+              <w:bottom w:val="single" w:color="808080" w:sz="4"/>
+              <w:right w:val="single" w:color="808080" w:sz="4"/>
+            </w:tcBorders>
+            <w:tcMar>
+              <w:top w:type="dxa" w:w="60"/>
+              <w:left w:type="dxa" w:w="100"/>
+              <w:bottom w:type="dxa" w:w="60"/>
+              <w:right w:type="dxa" w:w="100"/>
+            </w:tcMar>
+            <w:vAlign w:val="center"/>
+          </w:tcPr>
+          <w:p>
+            <w:pPr>
+              <w:spacing w:after="20" w:line="320"/>
+            </w:pPr>
+            <w:r>
+              <w:rPr>
+                <w:b w:val="false"/>
+                <w:bCs w:val="false"/>
+                <w:sz w:val="28"/>
+                <w:szCs w:val="28"/>
+              </w:rPr>
+              <w:t xml:space="preserve">ไม่เก็บ ไม่มีการ์ดติดป้าย (ประหยัด SD การ์ด)</w:t>
+            </w:r>
+          </w:p>
+        </w:tc>
+        <w:tc>
+          <w:tcPr>
+            <w:tcW w:type="dxa" w:w="2938"/>
+            <w:tcBorders>
+              <w:top w:val="single" w:color="808080" w:sz="4"/>
+              <w:left w:val="single" w:color="808080" w:sz="4"/>
+              <w:bottom w:val="single" w:color="808080" w:sz="4"/>
+              <w:right w:val="single" w:color="808080" w:sz="4"/>
+            </w:tcBorders>
+            <w:tcMar>
+              <w:top w:type="dxa" w:w="60"/>
+              <w:left w:type="dxa" w:w="100"/>
+              <w:bottom w:type="dxa" w:w="60"/>
+              <w:right w:type="dxa" w:w="100"/>
+            </w:tcMar>
+            <w:vAlign w:val="center"/>
+          </w:tcPr>
+          <w:p>
+            <w:pPr>
+              <w:spacing w:after="20" w:line="320"/>
+            </w:pPr>
+            <w:r>
+              <w:rPr>
+                <w:b w:val="false"/>
+                <w:bCs w:val="false"/>
+                <w:sz w:val="28"/>
+                <w:szCs w:val="28"/>
+              </w:rPr>
+              <w:t xml:space="preserve">ใช้งานจริงทุกวัน</w:t>
             </w:r>
           </w:p>
         </w:tc>
@@ -1477,103 +1491,103 @@
                 <w:sz w:val="28"/>
                 <w:szCs w:val="28"/>
               </w:rPr>
-              <w:t xml:space="preserve">demo</w:t>
-            </w:r>
-          </w:p>
-        </w:tc>
-        <w:tc>
-          <w:tcPr>
-            <w:tcW w:type="dxa" w:w="2200"/>
-            <w:tcBorders>
-              <w:top w:val="single" w:color="808080" w:sz="4"/>
-              <w:left w:val="single" w:color="808080" w:sz="4"/>
-              <w:bottom w:val="single" w:color="808080" w:sz="4"/>
-              <w:right w:val="single" w:color="808080" w:sz="4"/>
-            </w:tcBorders>
-            <w:tcMar>
-              <w:top w:type="dxa" w:w="60"/>
-              <w:left w:type="dxa" w:w="100"/>
-              <w:bottom w:type="dxa" w:w="60"/>
-              <w:right w:type="dxa" w:w="100"/>
-            </w:tcMar>
-            <w:vAlign w:val="center"/>
-          </w:tcPr>
-          <w:p>
-            <w:pPr>
-              <w:spacing w:after="20" w:line="320"/>
-            </w:pPr>
-            <w:r>
-              <w:rPr>
-                <w:b w:val="false"/>
-                <w:bCs w:val="false"/>
-                <w:sz w:val="28"/>
-                <w:szCs w:val="28"/>
-              </w:rPr>
-              <w:t xml:space="preserve">ตีกรอบโชว์ ไม่ไล่</w:t>
-            </w:r>
-          </w:p>
-        </w:tc>
-        <w:tc>
-          <w:tcPr>
-            <w:tcW w:type="dxa" w:w="2200"/>
-            <w:tcBorders>
-              <w:top w:val="single" w:color="808080" w:sz="4"/>
-              <w:left w:val="single" w:color="808080" w:sz="4"/>
-              <w:bottom w:val="single" w:color="808080" w:sz="4"/>
-              <w:right w:val="single" w:color="808080" w:sz="4"/>
-            </w:tcBorders>
-            <w:tcMar>
-              <w:top w:type="dxa" w:w="60"/>
-              <w:left w:type="dxa" w:w="100"/>
-              <w:bottom w:type="dxa" w:w="60"/>
-              <w:right w:type="dxa" w:w="100"/>
-            </w:tcMar>
-            <w:vAlign w:val="center"/>
-          </w:tcPr>
-          <w:p>
-            <w:pPr>
-              <w:spacing w:after="20" w:line="320"/>
-            </w:pPr>
-            <w:r>
-              <w:rPr>
-                <w:b w:val="false"/>
-                <w:bCs w:val="false"/>
-                <w:sz w:val="28"/>
-                <w:szCs w:val="28"/>
-              </w:rPr>
-              <w:t xml:space="preserve">0.25 เจอครั้งเดียว</w:t>
-            </w:r>
-          </w:p>
-        </w:tc>
-        <w:tc>
-          <w:tcPr>
-            <w:tcW w:type="dxa" w:w="3738"/>
-            <w:tcBorders>
-              <w:top w:val="single" w:color="808080" w:sz="4"/>
-              <w:left w:val="single" w:color="808080" w:sz="4"/>
-              <w:bottom w:val="single" w:color="808080" w:sz="4"/>
-              <w:right w:val="single" w:color="808080" w:sz="4"/>
-            </w:tcBorders>
-            <w:tcMar>
-              <w:top w:type="dxa" w:w="60"/>
-              <w:left w:type="dxa" w:w="100"/>
-              <w:bottom w:type="dxa" w:w="60"/>
-              <w:right w:type="dxa" w:w="100"/>
-            </w:tcMar>
-            <w:vAlign w:val="center"/>
-          </w:tcPr>
-          <w:p>
-            <w:pPr>
-              <w:spacing w:after="20" w:line="320"/>
-            </w:pPr>
-            <w:r>
-              <w:rPr>
-                <w:b w:val="false"/>
-                <w:bCs w:val="false"/>
-                <w:sz w:val="28"/>
-                <w:szCs w:val="28"/>
-              </w:rPr>
-              <w:t xml:space="preserve">สาธิตบนโต๊ะ</w:t>
+              <w:t xml:space="preserve">train</w:t>
+            </w:r>
+          </w:p>
+        </w:tc>
+        <w:tc>
+          <w:tcPr>
+            <w:tcW w:type="dxa" w:w="2700"/>
+            <w:tcBorders>
+              <w:top w:val="single" w:color="808080" w:sz="4"/>
+              <w:left w:val="single" w:color="808080" w:sz="4"/>
+              <w:bottom w:val="single" w:color="808080" w:sz="4"/>
+              <w:right w:val="single" w:color="808080" w:sz="4"/>
+            </w:tcBorders>
+            <w:tcMar>
+              <w:top w:type="dxa" w:w="60"/>
+              <w:left w:type="dxa" w:w="100"/>
+              <w:bottom w:type="dxa" w:w="60"/>
+              <w:right w:type="dxa" w:w="100"/>
+            </w:tcMar>
+            <w:vAlign w:val="center"/>
+          </w:tcPr>
+          <w:p>
+            <w:pPr>
+              <w:spacing w:after="20" w:line="320"/>
+            </w:pPr>
+            <w:r>
+              <w:rPr>
+                <w:b w:val="false"/>
+                <w:bCs w:val="false"/>
+                <w:sz w:val="28"/>
+                <w:szCs w:val="28"/>
+              </w:rPr>
+              <w:t xml:space="preserve">ค่าเริ่มต้นไม่ไล่ ให้นกอยู่ถ่ายได้หลายภาพ (เปิดไล่ได้ที่สวิตช์บนหน้าเว็บ)</w:t>
+            </w:r>
+          </w:p>
+        </w:tc>
+        <w:tc>
+          <w:tcPr>
+            <w:tcW w:type="dxa" w:w="2500"/>
+            <w:tcBorders>
+              <w:top w:val="single" w:color="808080" w:sz="4"/>
+              <w:left w:val="single" w:color="808080" w:sz="4"/>
+              <w:bottom w:val="single" w:color="808080" w:sz="4"/>
+              <w:right w:val="single" w:color="808080" w:sz="4"/>
+            </w:tcBorders>
+            <w:tcMar>
+              <w:top w:type="dxa" w:w="60"/>
+              <w:left w:type="dxa" w:w="100"/>
+              <w:bottom w:type="dxa" w:w="60"/>
+              <w:right w:type="dxa" w:w="100"/>
+            </w:tcMar>
+            <w:vAlign w:val="center"/>
+          </w:tcPr>
+          <w:p>
+            <w:pPr>
+              <w:spacing w:after="20" w:line="320"/>
+            </w:pPr>
+            <w:r>
+              <w:rPr>
+                <w:b w:val="false"/>
+                <w:bCs w:val="false"/>
+                <w:sz w:val="28"/>
+                <w:szCs w:val="28"/>
+              </w:rPr>
+              <w:t xml:space="preserve">เก็บถี่ พร้อมกรอบจากโมเดล มีการ์ดติดป้ายและดาวน์โหลด ZIP</w:t>
+            </w:r>
+          </w:p>
+        </w:tc>
+        <w:tc>
+          <w:tcPr>
+            <w:tcW w:type="dxa" w:w="2938"/>
+            <w:tcBorders>
+              <w:top w:val="single" w:color="808080" w:sz="4"/>
+              <w:left w:val="single" w:color="808080" w:sz="4"/>
+              <w:bottom w:val="single" w:color="808080" w:sz="4"/>
+              <w:right w:val="single" w:color="808080" w:sz="4"/>
+            </w:tcBorders>
+            <w:tcMar>
+              <w:top w:type="dxa" w:w="60"/>
+              <w:left w:type="dxa" w:w="100"/>
+              <w:bottom w:type="dxa" w:w="60"/>
+              <w:right w:type="dxa" w:w="100"/>
+            </w:tcMar>
+            <w:vAlign w:val="center"/>
+          </w:tcPr>
+          <w:p>
+            <w:pPr>
+              <w:spacing w:after="20" w:line="320"/>
+            </w:pPr>
+            <w:r>
+              <w:rPr>
+                <w:b w:val="false"/>
+                <w:bCs w:val="false"/>
+                <w:sz w:val="28"/>
+                <w:szCs w:val="28"/>
+              </w:rPr>
+              <w:t xml:space="preserve">ติดตั้งอุปกรณ์ครบแล้ว วางไว้หน้างานเพื่อเก็บภาพไปเทรน</w:t>
             </w:r>
           </w:p>
         </w:tc>
@@ -1610,103 +1624,103 @@
                 <w:sz w:val="28"/>
                 <w:szCs w:val="28"/>
               </w:rPr>
-              <w:t xml:space="preserve">real</w:t>
-            </w:r>
-          </w:p>
-        </w:tc>
-        <w:tc>
-          <w:tcPr>
-            <w:tcW w:type="dxa" w:w="2200"/>
-            <w:tcBorders>
-              <w:top w:val="single" w:color="808080" w:sz="4"/>
-              <w:left w:val="single" w:color="808080" w:sz="4"/>
-              <w:bottom w:val="single" w:color="808080" w:sz="4"/>
-              <w:right w:val="single" w:color="808080" w:sz="4"/>
-            </w:tcBorders>
-            <w:tcMar>
-              <w:top w:type="dxa" w:w="60"/>
-              <w:left w:type="dxa" w:w="100"/>
-              <w:bottom w:type="dxa" w:w="60"/>
-              <w:right w:type="dxa" w:w="100"/>
-            </w:tcMar>
-            <w:vAlign w:val="center"/>
-          </w:tcPr>
-          <w:p>
-            <w:pPr>
-              <w:spacing w:after="20" w:line="320"/>
-            </w:pPr>
-            <w:r>
-              <w:rPr>
-                <w:b w:val="false"/>
-                <w:bCs w:val="false"/>
-                <w:sz w:val="28"/>
-                <w:szCs w:val="28"/>
-              </w:rPr>
-              <w:t xml:space="preserve">ไล่จริง</w:t>
-            </w:r>
-          </w:p>
-        </w:tc>
-        <w:tc>
-          <w:tcPr>
-            <w:tcW w:type="dxa" w:w="2200"/>
-            <w:tcBorders>
-              <w:top w:val="single" w:color="808080" w:sz="4"/>
-              <w:left w:val="single" w:color="808080" w:sz="4"/>
-              <w:bottom w:val="single" w:color="808080" w:sz="4"/>
-              <w:right w:val="single" w:color="808080" w:sz="4"/>
-            </w:tcBorders>
-            <w:tcMar>
-              <w:top w:type="dxa" w:w="60"/>
-              <w:left w:type="dxa" w:w="100"/>
-              <w:bottom w:type="dxa" w:w="60"/>
-              <w:right w:type="dxa" w:w="100"/>
-            </w:tcMar>
-            <w:vAlign w:val="center"/>
-          </w:tcPr>
-          <w:p>
-            <w:pPr>
-              <w:spacing w:after="20" w:line="320"/>
-            </w:pPr>
-            <w:r>
-              <w:rPr>
-                <w:b w:val="false"/>
-                <w:bCs w:val="false"/>
-                <w:sz w:val="28"/>
-                <w:szCs w:val="28"/>
-              </w:rPr>
-              <w:t xml:space="preserve">0.35 และต้องเจอ 2 เฟรมติดกัน</w:t>
-            </w:r>
-          </w:p>
-        </w:tc>
-        <w:tc>
-          <w:tcPr>
-            <w:tcW w:type="dxa" w:w="3738"/>
-            <w:tcBorders>
-              <w:top w:val="single" w:color="808080" w:sz="4"/>
-              <w:left w:val="single" w:color="808080" w:sz="4"/>
-              <w:bottom w:val="single" w:color="808080" w:sz="4"/>
-              <w:right w:val="single" w:color="808080" w:sz="4"/>
-            </w:tcBorders>
-            <w:tcMar>
-              <w:top w:type="dxa" w:w="60"/>
-              <w:left w:type="dxa" w:w="100"/>
-              <w:bottom w:type="dxa" w:w="60"/>
-              <w:right w:type="dxa" w:w="100"/>
-            </w:tcMar>
-            <w:vAlign w:val="center"/>
-          </w:tcPr>
-          <w:p>
-            <w:pPr>
-              <w:spacing w:after="20" w:line="320"/>
-            </w:pPr>
-            <w:r>
-              <w:rPr>
-                <w:b w:val="false"/>
-                <w:bCs w:val="false"/>
-                <w:sz w:val="28"/>
-                <w:szCs w:val="28"/>
-              </w:rPr>
-              <w:t xml:space="preserve">ใช้งานจริงหลังเทรนโมเดลด้วยภาพจากหน้างานแล้ว</w:t>
+              <w:t xml:space="preserve">demo</w:t>
+            </w:r>
+          </w:p>
+        </w:tc>
+        <w:tc>
+          <w:tcPr>
+            <w:tcW w:type="dxa" w:w="2700"/>
+            <w:tcBorders>
+              <w:top w:val="single" w:color="808080" w:sz="4"/>
+              <w:left w:val="single" w:color="808080" w:sz="4"/>
+              <w:bottom w:val="single" w:color="808080" w:sz="4"/>
+              <w:right w:val="single" w:color="808080" w:sz="4"/>
+            </w:tcBorders>
+            <w:tcMar>
+              <w:top w:type="dxa" w:w="60"/>
+              <w:left w:type="dxa" w:w="100"/>
+              <w:bottom w:type="dxa" w:w="60"/>
+              <w:right w:type="dxa" w:w="100"/>
+            </w:tcMar>
+            <w:vAlign w:val="center"/>
+          </w:tcPr>
+          <w:p>
+            <w:pPr>
+              <w:spacing w:after="20" w:line="320"/>
+            </w:pPr>
+            <w:r>
+              <w:rPr>
+                <w:b w:val="false"/>
+                <w:bCs w:val="false"/>
+                <w:sz w:val="28"/>
+                <w:szCs w:val="28"/>
+              </w:rPr>
+              <w:t xml:space="preserve">ตีกรอบโชว์ ไม่ไล่ (เกณฑ์ 0.25 เจอครั้งเดียว)</w:t>
+            </w:r>
+          </w:p>
+        </w:tc>
+        <w:tc>
+          <w:tcPr>
+            <w:tcW w:type="dxa" w:w="2500"/>
+            <w:tcBorders>
+              <w:top w:val="single" w:color="808080" w:sz="4"/>
+              <w:left w:val="single" w:color="808080" w:sz="4"/>
+              <w:bottom w:val="single" w:color="808080" w:sz="4"/>
+              <w:right w:val="single" w:color="808080" w:sz="4"/>
+            </w:tcBorders>
+            <w:tcMar>
+              <w:top w:type="dxa" w:w="60"/>
+              <w:left w:type="dxa" w:w="100"/>
+              <w:bottom w:type="dxa" w:w="60"/>
+              <w:right w:type="dxa" w:w="100"/>
+            </w:tcMar>
+            <w:vAlign w:val="center"/>
+          </w:tcPr>
+          <w:p>
+            <w:pPr>
+              <w:spacing w:after="20" w:line="320"/>
+            </w:pPr>
+            <w:r>
+              <w:rPr>
+                <w:b w:val="false"/>
+                <w:bCs w:val="false"/>
+                <w:sz w:val="28"/>
+                <w:szCs w:val="28"/>
+              </w:rPr>
+              <w:t xml:space="preserve">ไม่เก็บ</w:t>
+            </w:r>
+          </w:p>
+        </w:tc>
+        <w:tc>
+          <w:tcPr>
+            <w:tcW w:type="dxa" w:w="2938"/>
+            <w:tcBorders>
+              <w:top w:val="single" w:color="808080" w:sz="4"/>
+              <w:left w:val="single" w:color="808080" w:sz="4"/>
+              <w:bottom w:val="single" w:color="808080" w:sz="4"/>
+              <w:right w:val="single" w:color="808080" w:sz="4"/>
+            </w:tcBorders>
+            <w:tcMar>
+              <w:top w:type="dxa" w:w="60"/>
+              <w:left w:type="dxa" w:w="100"/>
+              <w:bottom w:type="dxa" w:w="60"/>
+              <w:right w:type="dxa" w:w="100"/>
+            </w:tcMar>
+            <w:vAlign w:val="center"/>
+          </w:tcPr>
+          <w:p>
+            <w:pPr>
+              <w:spacing w:after="20" w:line="320"/>
+            </w:pPr>
+            <w:r>
+              <w:rPr>
+                <w:b w:val="false"/>
+                <w:bCs w:val="false"/>
+                <w:sz w:val="28"/>
+                <w:szCs w:val="28"/>
+              </w:rPr>
+              <w:t xml:space="preserve">สาธิตบนโต๊ะ</w:t>
             </w:r>
           </w:p>
         </w:tc>
@@ -5248,7 +5262,7 @@
                 <w:sz w:val="28"/>
                 <w:szCs w:val="28"/>
               </w:rPr>
-              <w:t xml:space="preserve">ติดป้ายภาพและดาวน์โหลด ZIP ไปเทรน (หัวข้อ 5.10)</w:t>
+              <w:t xml:space="preserve">มีเฉพาะเวอร์ชัน train: ติดป้ายภาพและดาวน์โหลด ZIP ไปเทรน (หัวข้อ 5.10)</w:t>
             </w:r>
           </w:p>
         </w:tc>
@@ -7088,7 +7102,7 @@
           <w:sz w:val="34"/>
           <w:szCs w:val="34"/>
         </w:rPr>
-        <w:t xml:space="preserve">5.10 เก็บภาพและติดป้ายสำหรับเทรนโมเดล</w:t>
+        <w:t xml:space="preserve">5.10 เก็บภาพและติดป้ายสำหรับเทรนโมเดล (เวอร์ชัน train)</w:t>
       </w:r>
       <w:bookmarkEnd w:id="16"/>
     </w:p>
@@ -7142,7 +7156,7 @@
             <w:r>
               <w:drawing>
                 <wp:inline distT="0" distB="0" distL="0" distR="0">
-                  <wp:extent cx="2190750" cy="7229475"/>
+                  <wp:extent cx="2190750" cy="6286500"/>
                   <wp:effectExtent t="0" r="0" b="0" l="0"/>
                   <wp:docPr id="14" name="" descr="" title=""/>
                   <wp:cNvGraphicFramePr>
@@ -7167,7 +7181,7 @@
                         <pic:spPr bwMode="auto">
                           <a:xfrm>
                             <a:off x="0" y="0"/>
-                            <a:ext cx="2190750" cy="7229475"/>
+                            <a:ext cx="2190750" cy="6286500"/>
                           </a:xfrm>
                           <a:prstGeom prst="rect">
                             <a:avLst/>
@@ -9365,7 +9379,7 @@
                 <w:sz w:val="28"/>
                 <w:szCs w:val="28"/>
               </w:rPr>
-              <w:t xml:space="preserve">ปิดสวิตช์ไล่อัตโนมัติ / อยู่โหมด demo / เจอนกเฟรมเดียว / อยู่ในช่วงพัก 10 วินาที / ครบโควตา</w:t>
+              <w:t xml:space="preserve">ปิดสวิตช์ไล่อัตโนมัติ / อยู่เวอร์ชัน train (ค่าเริ่มต้นไม่ไล่) หรือ demo / เจอนกเฟรมเดียว / อยู่ในช่วงพัก 10 วินาที / ครบโควตา</w:t>
             </w:r>
           </w:p>
         </w:tc>
@@ -11006,7 +11020,7 @@
                 <w:sz w:val="28"/>
                 <w:szCs w:val="28"/>
               </w:rPr>
-              <w:t xml:space="preserve">BIRD_MODE</w:t>
+              <w:t xml:space="preserve">MODE_DEFAULT / BIRD_MODE</w:t>
             </w:r>
           </w:p>
         </w:tc>
@@ -11038,7 +11052,7 @@
                 <w:sz w:val="28"/>
                 <w:szCs w:val="28"/>
               </w:rPr>
-              <w:t xml:space="preserve">field</w:t>
+              <w:t xml:space="preserve">normal</w:t>
             </w:r>
           </w:p>
         </w:tc>
@@ -11070,7 +11084,7 @@
                 <w:sz w:val="28"/>
                 <w:szCs w:val="28"/>
               </w:rPr>
-              <w:t xml:space="preserve">โหมดทำงาน: field / demo / real</w:t>
+              <w:t xml:space="preserve">เวอร์ชัน: normal / train / demo</w:t>
             </w:r>
           </w:p>
         </w:tc>

</xml_diff>

<commit_message>
Server v7.2 / firmware v7.9: instant sharp capture, fewer duplicate training images, 3 s spray
- Capture button grabs the sharpest of ~5 frames at press time and jumps the
  detection queue; auto shots pick the sharper of 2 frames
- Training set: skip auto images nearly identical to the last saved one (same
  boxes), per-reason minimum gaps, time-based random backgrounds
- Training card: "remove duplicates" and "delete whole tab" (unlabeled / no
  bird) buttons, free-space readout; files deleted outside the server drop
  out of the list
- Dataset images and labels are fsync'd; broken JPEGs left by power loss are
  removed on startup
- Firmware v7.9: repel spray 3 s by default, adjustable 1-8 s from the web
  (RCFG third argument, STAT RPM=); web pump button uses the same time

Co-Authored-By: Claude Opus 5.5 <noreply@anthropic.com>
Claude-Session: https://claude.ai/code/session_01SdR1RsRyVyFgrWst25ZXhg
</commit_message>
<xml_diff>
--- a/bird_repeller/docs/คู่มือการใช้งานเครื่องไล่นกอัตโนมัติ.docx
+++ b/bird_repeller/docs/คู่มือการใช้งานเครื่องไล่นกอัตโนมัติ.docx
@@ -168,7 +168,7 @@
           <w:sz w:val="28"/>
           <w:szCs w:val="28"/>
         </w:rPr>
-        <w:t xml:space="preserve">เอกสารนี้ใช้คู่กับเฟิร์มแวร์บอร์ดควบคุม BIRDCTRL v7.8 และเซิร์ฟเวอร์ v7.1</w:t>
+        <w:t xml:space="preserve">เอกสารนี้ใช้คู่กับเฟิร์มแวร์บอร์ดควบคุม BIRDCTRL v7.9 และเซิร์ฟเวอร์ v7.2</w:t>
       </w:r>
     </w:p>
     <w:p>
@@ -970,7 +970,7 @@
           <w:sz w:val="32"/>
           <w:szCs w:val="32"/>
         </w:rPr>
-        <w:t xml:space="preserve">เมื่อเจอนกติดกัน 2 เฟรม ระบบสั่งไล่: หัวฉีดกลับจุดกลาง เปิดปั๊มน้ำ 2 วินาที พร้อมกวาดหัวฉีดซ้ายขวา ±40° แล้วกลับจุดกลาง</w:t>
+        <w:t xml:space="preserve">เมื่อเจอนกติดกัน 2 เฟรม ระบบสั่งไล่: หัวฉีดกลับจุดกลาง เปิดปั๊มน้ำ 3 วินาที (ปรับได้ 1–8 วินาที) พร้อมกวาดหัวฉีดซ้ายขวา ±40° แล้วกลับจุดกลาง</w:t>
       </w:r>
     </w:p>
     <w:p>
@@ -2178,7 +2178,7 @@
                 <w:sz w:val="28"/>
                 <w:szCs w:val="28"/>
               </w:rPr>
-              <w:t xml:space="preserve">บอร์ด ESP32 (เฟิร์มแวร์ BIRDCTRL v7.8)</w:t>
+              <w:t xml:space="preserve">บอร์ด ESP32 (เฟิร์มแวร์ BIRDCTRL v7.9)</w:t>
             </w:r>
           </w:p>
         </w:tc>
@@ -3161,7 +3161,7 @@
           <w:sz w:val="32"/>
           <w:szCs w:val="32"/>
         </w:rPr>
-        <w:t xml:space="preserve">ไล่นกด้วยน้ำ ปั๊มน้ำ 12V เปิดครั้งละ 2 วินาที (ประมาณ 50–70 มิลลิลิตร) ใช้ถังน้ำ 5 ลิตรไล่ได้ราว 70–100 ครั้ง</w:t>
+        <w:t xml:space="preserve">ไล่นกด้วยน้ำ ปั๊มน้ำ 12V เปิดครั้งละ 3 วินาที (ประมาณ 75–100 มิลลิลิตร) ใช้ถังน้ำ 5 ลิตรไล่ได้ราว 50–65 ครั้ง</w:t>
       </w:r>
     </w:p>
     <w:p>
@@ -6019,6 +6019,107 @@
           </w:p>
         </w:tc>
       </w:tr>
+      <w:tr>
+        <w:trPr>
+          <w:cantSplit/>
+        </w:trPr>
+        <w:tc>
+          <w:tcPr>
+            <w:tcW w:type="dxa" w:w="2600"/>
+            <w:tcBorders>
+              <w:top w:val="single" w:color="808080" w:sz="4"/>
+              <w:left w:val="single" w:color="808080" w:sz="4"/>
+              <w:bottom w:val="single" w:color="808080" w:sz="4"/>
+              <w:right w:val="single" w:color="808080" w:sz="4"/>
+            </w:tcBorders>
+            <w:tcMar>
+              <w:top w:type="dxa" w:w="60"/>
+              <w:left w:type="dxa" w:w="100"/>
+              <w:bottom w:type="dxa" w:w="60"/>
+              <w:right w:type="dxa" w:w="100"/>
+            </w:tcMar>
+            <w:vAlign w:val="center"/>
+          </w:tcPr>
+          <w:p>
+            <w:pPr>
+              <w:spacing w:after="20" w:line="320"/>
+            </w:pPr>
+            <w:r>
+              <w:rPr>
+                <w:b w:val="false"/>
+                <w:bCs w:val="false"/>
+                <w:sz w:val="28"/>
+                <w:szCs w:val="28"/>
+              </w:rPr>
+              <w:t xml:space="preserve">ฉีดน้ำ</w:t>
+            </w:r>
+          </w:p>
+        </w:tc>
+        <w:tc>
+          <w:tcPr>
+            <w:tcW w:type="dxa" w:w="2000"/>
+            <w:tcBorders>
+              <w:top w:val="single" w:color="808080" w:sz="4"/>
+              <w:left w:val="single" w:color="808080" w:sz="4"/>
+              <w:bottom w:val="single" w:color="808080" w:sz="4"/>
+              <w:right w:val="single" w:color="808080" w:sz="4"/>
+            </w:tcBorders>
+            <w:tcMar>
+              <w:top w:type="dxa" w:w="60"/>
+              <w:left w:type="dxa" w:w="100"/>
+              <w:bottom w:type="dxa" w:w="60"/>
+              <w:right w:type="dxa" w:w="100"/>
+            </w:tcMar>
+            <w:vAlign w:val="center"/>
+          </w:tcPr>
+          <w:p>
+            <w:pPr>
+              <w:spacing w:after="20" w:line="320"/>
+            </w:pPr>
+            <w:r>
+              <w:rPr>
+                <w:b w:val="false"/>
+                <w:bCs w:val="false"/>
+                <w:sz w:val="28"/>
+                <w:szCs w:val="28"/>
+              </w:rPr>
+              <w:t xml:space="preserve">1–8 วินาที (ค่าเริ่มต้น 3 วินาที)</w:t>
+            </w:r>
+          </w:p>
+        </w:tc>
+        <w:tc>
+          <w:tcPr>
+            <w:tcW w:type="dxa" w:w="5038"/>
+            <w:tcBorders>
+              <w:top w:val="single" w:color="808080" w:sz="4"/>
+              <w:left w:val="single" w:color="808080" w:sz="4"/>
+              <w:bottom w:val="single" w:color="808080" w:sz="4"/>
+              <w:right w:val="single" w:color="808080" w:sz="4"/>
+            </w:tcBorders>
+            <w:tcMar>
+              <w:top w:type="dxa" w:w="60"/>
+              <w:left w:type="dxa" w:w="100"/>
+              <w:bottom w:type="dxa" w:w="60"/>
+              <w:right w:type="dxa" w:w="100"/>
+            </w:tcMar>
+            <w:vAlign w:val="center"/>
+          </w:tcPr>
+          <w:p>
+            <w:pPr>
+              <w:spacing w:after="20" w:line="320"/>
+            </w:pPr>
+            <w:r>
+              <w:rPr>
+                <w:b w:val="false"/>
+                <w:bCs w:val="false"/>
+                <w:sz w:val="28"/>
+                <w:szCs w:val="28"/>
+              </w:rPr>
+              <w:t xml:space="preserve">เวลาเปิดปั๊มต่อรอบไล่ ปุ่มปั๊มน้ำบนหน้าเว็บก็เปิดนานเท่านี้ (ต้องใช้เฟิร์มแวร์ v7.9)</w:t>
+            </w:r>
+          </w:p>
+        </w:tc>
+      </w:tr>
     </w:tbl>
     <w:p>
       <w:pPr>
@@ -6099,7 +6200,7 @@
           <w:sz w:val="32"/>
           <w:szCs w:val="32"/>
         </w:rPr>
-        <w:t xml:space="preserve">เลื่อนแถบให้ได้ค่าที่ต้องการ แล้วกด "บันทึกการกวาด" (ESP32 จำค่าไว้ในแฟลช ปิดเครื่องแล้วไม่หาย)</w:t>
+        <w:t xml:space="preserve">เลื่อนแถบให้ได้ค่าที่ต้องการ แล้วกด "บันทึกการไล่" (ESP32 จำค่าไว้ในแฟลช ปิดเครื่องแล้วไม่หาย)</w:t>
       </w:r>
     </w:p>
     <w:p>
@@ -6549,7 +6650,7 @@
                 <w:sz w:val="28"/>
                 <w:szCs w:val="28"/>
               </w:rPr>
-              <w:t xml:space="preserve">ปั๊มน้ำ 2 วินาที</w:t>
+              <w:t xml:space="preserve">ปั๊มน้ำ 3 วินาที</w:t>
             </w:r>
           </w:p>
         </w:tc>
@@ -6581,7 +6682,7 @@
                 <w:sz w:val="28"/>
                 <w:szCs w:val="28"/>
               </w:rPr>
-              <w:t xml:space="preserve">เปิดปั๊ม 2 วินาที ถ้าสั่งซ้ำตอนปั๊มเปิดอยู่จะถูกปฏิเสธ และต้องพักอย่างน้อย 3 วินาทีก่อนเปิดซ้ำ</w:t>
+              <w:t xml:space="preserve">เปิดปั๊มนานเท่าเวลาฉีดน้ำที่ตั้งไว้ (ค่าเริ่มต้น 3 วินาที) ถ้าสั่งซ้ำตอนปั๊มเปิดอยู่จะถูกปฏิเสธ และต้องพักอย่างน้อย 3 วินาทีก่อนเปิดซ้ำ</w:t>
             </w:r>
           </w:p>
         </w:tc>
@@ -7156,7 +7257,7 @@
             <w:r>
               <w:drawing>
                 <wp:inline distT="0" distB="0" distL="0" distR="0">
-                  <wp:extent cx="2190750" cy="6286500"/>
+                  <wp:extent cx="2190750" cy="5448300"/>
                   <wp:effectExtent t="0" r="0" b="0" l="0"/>
                   <wp:docPr id="14" name="" descr="" title=""/>
                   <wp:cNvGraphicFramePr>
@@ -7181,7 +7282,7 @@
                         <pic:spPr bwMode="auto">
                           <a:xfrm>
                             <a:off x="0" y="0"/>
-                            <a:ext cx="2190750" cy="6286500"/>
+                            <a:ext cx="2190750" cy="5448300"/>
                           </a:xfrm>
                           <a:prstGeom prst="rect">
                             <a:avLst/>
@@ -7385,6 +7486,273 @@
           <w:szCs w:val="32"/>
         </w:rPr>
         <w:t xml:space="preserve">แปลงเป็น NCNN ด้วย yolo export model=best.pt format=ncnn แล้ววางแทนโฟลเดอร์ yolov8n_ncnn_model บน Pi (สำรองของเดิมไว้ก่อน) เซิร์ฟเวอร์หาเลขคลาส bird ของโมเดลใหม่ให้เอง</w:t>
+      </w:r>
+    </w:p>
+    <w:p>
+      <w:pPr>
+        <w:spacing w:after="120" w:line="340"/>
+      </w:pPr>
+      <w:r>
+        <w:rPr>
+          <w:sz w:val="32"/>
+          <w:szCs w:val="32"/>
+        </w:rPr>
+        <w:t xml:space="preserve">ไฟล์ภาพอยู่บน Pi ที่โฟลเดอร์ ~/bird_images/dataset/ (ภาพ .jpg คู่กับไฟล์กรอบ .json) ป้ายที่ติดเก็บใน labels.json โฟลเดอร์เดียวกัน</w:t>
+      </w:r>
+    </w:p>
+    <w:p>
+      <w:pPr>
+        <w:spacing w:after="120" w:line="340"/>
+      </w:pPr>
+      <w:r>
+        <w:rPr>
+          <w:sz w:val="32"/>
+          <w:szCs w:val="32"/>
+        </w:rPr>
+        <w:t xml:space="preserve">ระบบไม่เก็บภาพอัตโนมัติที่แทบเหมือนภาพที่เก็บล่าสุด เมื่อภาพเยอะแล้วลดจำนวนได้ที่หัวข้อ "ลดจำนวนภาพ" ในการ์ด:</w:t>
+      </w:r>
+    </w:p>
+    <w:tbl>
+      <w:tblPr>
+        <w:tblW w:type="dxa" w:w="9638"/>
+        <w:tblBorders>
+          <w:top w:val="single" w:color="auto" w:sz="4"/>
+          <w:left w:val="single" w:color="auto" w:sz="4"/>
+          <w:bottom w:val="single" w:color="auto" w:sz="4"/>
+          <w:right w:val="single" w:color="auto" w:sz="4"/>
+          <w:insideH w:val="single" w:color="auto" w:sz="4"/>
+          <w:insideV w:val="single" w:color="auto" w:sz="4"/>
+        </w:tblBorders>
+      </w:tblPr>
+      <w:tblGrid>
+        <w:gridCol w:w="3000"/>
+        <w:gridCol w:w="6638"/>
+      </w:tblGrid>
+      <w:tr>
+        <w:trPr>
+          <w:tblHeader/>
+        </w:trPr>
+        <w:tc>
+          <w:tcPr>
+            <w:tcW w:type="dxa" w:w="3000"/>
+            <w:tcBorders>
+              <w:top w:val="single" w:color="808080" w:sz="4"/>
+              <w:left w:val="single" w:color="808080" w:sz="4"/>
+              <w:bottom w:val="single" w:color="808080" w:sz="4"/>
+              <w:right w:val="single" w:color="808080" w:sz="4"/>
+            </w:tcBorders>
+            <w:shd w:fill="D9E2F3" w:color="auto" w:val="clear"/>
+            <w:tcMar>
+              <w:top w:type="dxa" w:w="60"/>
+              <w:left w:type="dxa" w:w="100"/>
+              <w:bottom w:type="dxa" w:w="60"/>
+              <w:right w:type="dxa" w:w="100"/>
+            </w:tcMar>
+            <w:vAlign w:val="center"/>
+          </w:tcPr>
+          <w:p>
+            <w:pPr>
+              <w:spacing w:after="20" w:line="320"/>
+            </w:pPr>
+            <w:r>
+              <w:rPr>
+                <w:b/>
+                <w:bCs/>
+                <w:sz w:val="28"/>
+                <w:szCs w:val="28"/>
+              </w:rPr>
+              <w:t xml:space="preserve">ปุ่ม</w:t>
+            </w:r>
+          </w:p>
+        </w:tc>
+        <w:tc>
+          <w:tcPr>
+            <w:tcW w:type="dxa" w:w="6638"/>
+            <w:tcBorders>
+              <w:top w:val="single" w:color="808080" w:sz="4"/>
+              <w:left w:val="single" w:color="808080" w:sz="4"/>
+              <w:bottom w:val="single" w:color="808080" w:sz="4"/>
+              <w:right w:val="single" w:color="808080" w:sz="4"/>
+            </w:tcBorders>
+            <w:shd w:fill="D9E2F3" w:color="auto" w:val="clear"/>
+            <w:tcMar>
+              <w:top w:type="dxa" w:w="60"/>
+              <w:left w:type="dxa" w:w="100"/>
+              <w:bottom w:type="dxa" w:w="60"/>
+              <w:right w:type="dxa" w:w="100"/>
+            </w:tcMar>
+            <w:vAlign w:val="center"/>
+          </w:tcPr>
+          <w:p>
+            <w:pPr>
+              <w:spacing w:after="20" w:line="320"/>
+            </w:pPr>
+            <w:r>
+              <w:rPr>
+                <w:b/>
+                <w:bCs/>
+                <w:sz w:val="28"/>
+                <w:szCs w:val="28"/>
+              </w:rPr>
+              <w:t xml:space="preserve">การทำงาน</w:t>
+            </w:r>
+          </w:p>
+        </w:tc>
+      </w:tr>
+      <w:tr>
+        <w:trPr>
+          <w:cantSplit/>
+        </w:trPr>
+        <w:tc>
+          <w:tcPr>
+            <w:tcW w:type="dxa" w:w="3000"/>
+            <w:tcBorders>
+              <w:top w:val="single" w:color="808080" w:sz="4"/>
+              <w:left w:val="single" w:color="808080" w:sz="4"/>
+              <w:bottom w:val="single" w:color="808080" w:sz="4"/>
+              <w:right w:val="single" w:color="808080" w:sz="4"/>
+            </w:tcBorders>
+            <w:tcMar>
+              <w:top w:type="dxa" w:w="60"/>
+              <w:left w:type="dxa" w:w="100"/>
+              <w:bottom w:type="dxa" w:w="60"/>
+              <w:right w:type="dxa" w:w="100"/>
+            </w:tcMar>
+            <w:vAlign w:val="center"/>
+          </w:tcPr>
+          <w:p>
+            <w:pPr>
+              <w:spacing w:after="20" w:line="320"/>
+            </w:pPr>
+            <w:r>
+              <w:rPr>
+                <w:b w:val="false"/>
+                <w:bCs w:val="false"/>
+                <w:sz w:val="28"/>
+                <w:szCs w:val="28"/>
+              </w:rPr>
+              <w:t xml:space="preserve">🧹 ลบภาพซ้ำ</w:t>
+            </w:r>
+          </w:p>
+        </w:tc>
+        <w:tc>
+          <w:tcPr>
+            <w:tcW w:type="dxa" w:w="6638"/>
+            <w:tcBorders>
+              <w:top w:val="single" w:color="808080" w:sz="4"/>
+              <w:left w:val="single" w:color="808080" w:sz="4"/>
+              <w:bottom w:val="single" w:color="808080" w:sz="4"/>
+              <w:right w:val="single" w:color="808080" w:sz="4"/>
+            </w:tcBorders>
+            <w:tcMar>
+              <w:top w:type="dxa" w:w="60"/>
+              <w:left w:type="dxa" w:w="100"/>
+              <w:bottom w:type="dxa" w:w="60"/>
+              <w:right w:type="dxa" w:w="100"/>
+            </w:tcMar>
+            <w:vAlign w:val="center"/>
+          </w:tcPr>
+          <w:p>
+            <w:pPr>
+              <w:spacing w:after="20" w:line="320"/>
+            </w:pPr>
+            <w:r>
+              <w:rPr>
+                <w:b w:val="false"/>
+                <w:bCs w:val="false"/>
+                <w:sz w:val="28"/>
+                <w:szCs w:val="28"/>
+              </w:rPr>
+              <w:t xml:space="preserve">ลบภาพที่แทบเหมือนภาพก่อนหน้าและกรอบอยู่ที่เดิม ไม่ลบภาพที่ติดป้ายแล้วและภาพที่กดถ่ายเอง</w:t>
+            </w:r>
+          </w:p>
+        </w:tc>
+      </w:tr>
+      <w:tr>
+        <w:trPr>
+          <w:cantSplit/>
+        </w:trPr>
+        <w:tc>
+          <w:tcPr>
+            <w:tcW w:type="dxa" w:w="3000"/>
+            <w:tcBorders>
+              <w:top w:val="single" w:color="808080" w:sz="4"/>
+              <w:left w:val="single" w:color="808080" w:sz="4"/>
+              <w:bottom w:val="single" w:color="808080" w:sz="4"/>
+              <w:right w:val="single" w:color="808080" w:sz="4"/>
+            </w:tcBorders>
+            <w:tcMar>
+              <w:top w:type="dxa" w:w="60"/>
+              <w:left w:type="dxa" w:w="100"/>
+              <w:bottom w:type="dxa" w:w="60"/>
+              <w:right w:type="dxa" w:w="100"/>
+            </w:tcMar>
+            <w:vAlign w:val="center"/>
+          </w:tcPr>
+          <w:p>
+            <w:pPr>
+              <w:spacing w:after="20" w:line="320"/>
+            </w:pPr>
+            <w:r>
+              <w:rPr>
+                <w:b w:val="false"/>
+                <w:bCs w:val="false"/>
+                <w:sz w:val="28"/>
+                <w:szCs w:val="28"/>
+              </w:rPr>
+              <w:t xml:space="preserve">🗑 ลบทั้งหมดในแท็บนี้</w:t>
+            </w:r>
+          </w:p>
+        </w:tc>
+        <w:tc>
+          <w:tcPr>
+            <w:tcW w:type="dxa" w:w="6638"/>
+            <w:tcBorders>
+              <w:top w:val="single" w:color="808080" w:sz="4"/>
+              <w:left w:val="single" w:color="808080" w:sz="4"/>
+              <w:bottom w:val="single" w:color="808080" w:sz="4"/>
+              <w:right w:val="single" w:color="808080" w:sz="4"/>
+            </w:tcBorders>
+            <w:tcMar>
+              <w:top w:type="dxa" w:w="60"/>
+              <w:left w:type="dxa" w:w="100"/>
+              <w:bottom w:type="dxa" w:w="60"/>
+              <w:right w:type="dxa" w:w="100"/>
+            </w:tcMar>
+            <w:vAlign w:val="center"/>
+          </w:tcPr>
+          <w:p>
+            <w:pPr>
+              <w:spacing w:after="20" w:line="320"/>
+            </w:pPr>
+            <w:r>
+              <w:rPr>
+                <w:b w:val="false"/>
+                <w:bCs w:val="false"/>
+                <w:sz w:val="28"/>
+                <w:szCs w:val="28"/>
+              </w:rPr>
+              <w:t xml:space="preserve">ใช้ได้กับแท็บ "ยังไม่ติดป้าย" และ "ไม่มีนก" ลบแล้วกู้คืนไม่ได้ ควรดาวน์โหลด ZIP เก็บไว้ก่อน</w:t>
+            </w:r>
+          </w:p>
+        </w:tc>
+      </w:tr>
+    </w:tbl>
+    <w:p>
+      <w:pPr>
+        <w:spacing w:after="120"/>
+      </w:pPr>
+    </w:p>
+    <w:p>
+      <w:pPr>
+        <w:spacing w:after="120" w:line="340"/>
+      </w:pPr>
+      <w:r>
+        <w:rPr>
+          <w:sz w:val="32"/>
+          <w:szCs w:val="32"/>
+        </w:rPr>
+        <w:t xml:space="preserve">ภาพที่แสดงเป็นเครื่องหมาย ? คือไฟล์เสียจากการตัดไฟขณะ Pi กำลังเขียนไฟล์ เซิร์ฟเวอร์ลบให้เองตอนเปิดใหม่ ควรปิดเครื่องด้วยคำสั่ง sudo shutdown -h now แล้วรอไฟเขียวบน Pi ดับก่อนตัดไฟทุกครั้ง</w:t>
       </w:r>
     </w:p>
     <w:p>

</xml_diff>

<commit_message>
Server v7.3: "repel on a single frame" switch
New web toggle under auto-repel: when on, one frame with a bird triggers the
spray immediately instead of waiting for the confirm frame. Saved in
settings.json so it survives restarts; hidden in demo mode where one frame
already counts.

Co-Authored-By: Claude Opus 5.5 <noreply@anthropic.com>
Claude-Session: https://claude.ai/code/session_01SdR1RsRyVyFgrWst25ZXhg
</commit_message>
<xml_diff>
--- a/bird_repeller/docs/คู่มือการใช้งานเครื่องไล่นกอัตโนมัติ.docx
+++ b/bird_repeller/docs/คู่มือการใช้งานเครื่องไล่นกอัตโนมัติ.docx
@@ -168,7 +168,7 @@
           <w:sz w:val="28"/>
           <w:szCs w:val="28"/>
         </w:rPr>
-        <w:t xml:space="preserve">เอกสารนี้ใช้คู่กับเฟิร์มแวร์บอร์ดควบคุม BIRDCTRL v7.9 และเซิร์ฟเวอร์ v7.2</w:t>
+        <w:t xml:space="preserve">เอกสารนี้ใช้คู่กับเฟิร์มแวร์บอร์ดควบคุม BIRDCTRL v7.9 และเซิร์ฟเวอร์ v7.3</w:t>
       </w:r>
     </w:p>
     <w:p>
@@ -4849,6 +4849,75 @@
                 <w:szCs w:val="28"/>
               </w:rPr>
               <w:t xml:space="preserve">เปิดให้สั่งไล่เองเมื่อเจอนกครบตามเงื่อนไข ปิดแล้วเครื่องจะแค่ตรวจและแจ้ง ไม่ฉีดน้ำ</w:t>
+            </w:r>
+          </w:p>
+        </w:tc>
+      </w:tr>
+      <w:tr>
+        <w:trPr>
+          <w:cantSplit/>
+        </w:trPr>
+        <w:tc>
+          <w:tcPr>
+            <w:tcW w:type="dxa" w:w="2600"/>
+            <w:tcBorders>
+              <w:top w:val="single" w:color="808080" w:sz="4"/>
+              <w:left w:val="single" w:color="808080" w:sz="4"/>
+              <w:bottom w:val="single" w:color="808080" w:sz="4"/>
+              <w:right w:val="single" w:color="808080" w:sz="4"/>
+            </w:tcBorders>
+            <w:tcMar>
+              <w:top w:type="dxa" w:w="60"/>
+              <w:left w:type="dxa" w:w="100"/>
+              <w:bottom w:type="dxa" w:w="60"/>
+              <w:right w:type="dxa" w:w="100"/>
+            </w:tcMar>
+            <w:vAlign w:val="center"/>
+          </w:tcPr>
+          <w:p>
+            <w:pPr>
+              <w:spacing w:after="20" w:line="320"/>
+            </w:pPr>
+            <w:r>
+              <w:rPr>
+                <w:b w:val="false"/>
+                <w:bCs w:val="false"/>
+                <w:sz w:val="28"/>
+                <w:szCs w:val="28"/>
+              </w:rPr>
+              <w:t xml:space="preserve">สวิตช์ ไล่ทันทีเมื่อเจอภาพเดียว</w:t>
+            </w:r>
+          </w:p>
+        </w:tc>
+        <w:tc>
+          <w:tcPr>
+            <w:tcW w:type="dxa" w:w="7038"/>
+            <w:tcBorders>
+              <w:top w:val="single" w:color="808080" w:sz="4"/>
+              <w:left w:val="single" w:color="808080" w:sz="4"/>
+              <w:bottom w:val="single" w:color="808080" w:sz="4"/>
+              <w:right w:val="single" w:color="808080" w:sz="4"/>
+            </w:tcBorders>
+            <w:tcMar>
+              <w:top w:type="dxa" w:w="60"/>
+              <w:left w:type="dxa" w:w="100"/>
+              <w:bottom w:type="dxa" w:w="60"/>
+              <w:right w:type="dxa" w:w="100"/>
+            </w:tcMar>
+            <w:vAlign w:val="center"/>
+          </w:tcPr>
+          <w:p>
+            <w:pPr>
+              <w:spacing w:after="20" w:line="320"/>
+            </w:pPr>
+            <w:r>
+              <w:rPr>
+                <w:b w:val="false"/>
+                <w:bCs w:val="false"/>
+                <w:sz w:val="28"/>
+                <w:szCs w:val="28"/>
+              </w:rPr>
+              <w:t xml:space="preserve">ปิด (ค่าเริ่มต้น) = ต้องเจอนก 2 ภาพติดกันก่อนไล่ เปิด = เจอภาพเดียวก็ฉีดน้ำทันที เร็วขึ้นราว 3 วินาที แต่ของที่โมเดลเห็นผิดภาพเดียวก็โดนไล่ ระบบจำค่าไว้แม้ปิดเครื่อง</w:t>
             </w:r>
           </w:p>
         </w:tc>

</xml_diff>